<commit_message>
Rework Part 2 ideation with CREATE-Inside class frameworks
- Part 2: Customer Expansion (opportunity 2x2) as the selected model, with
  Product Expansion / Value Chain Analysis as the alternative
- Part 3: classification, corporate assets and obstacles tied to the class
  definitions (Big I vs little i, corporate advantages, corporate immune system)
- Part 4: revenue mechanism named with the New Business Model Templates
- Sources: add course handouts as [16]

Co-Authored-By: Claude Opus 5.5 <noreply@anthropic.com>
Claude-Session: https://claude.ai/code/session_01K6ifDrhe3QYRb8Qwvvhyqu
</commit_message>
<xml_diff>
--- a/Meta_Connect_Forensic_Intrapreneurship_Ray-Ban_Meta_Audio.docx
+++ b/Meta_Connect_Forensic_Intrapreneurship_Ray-Ban_Meta_Audio.docx
@@ -430,10 +430,10 @@
               <w:rPr>
                 <w:b/>
               </w:rPr>
-              <w:t>Systematic Inventive Thinking (SIT): the Subtraction technique</w:t>
+              <w:t>Customer Expansion</w:t>
             </w:r>
             <w:r>
-              <w:t xml:space="preserve"> (“innovation inside the box”). You remove an essential component from an existing product, then look for who benefits from what's left.</w:t>
+              <w:t xml:space="preserve"> from the class's “Where Do You Find New Opportunities?” 2×2 matrix (existing offering, new customers). It is worked with the tools the class pairs with it: personas, and a list of key company strengths matched against new markets [16].</w:t>
             </w:r>
           </w:p>
         </w:tc>
@@ -465,7 +465,25 @@
               <w:pStyle w:val="ListBullet"/>
             </w:pPr>
             <w:r>
-              <w:t>Start from an existing product and list its components (the “closed world”).</w:t>
+              <w:t xml:space="preserve">Starts from an </w:t>
+            </w:r>
+            <w:r>
+              <w:rPr>
+                <w:b/>
+              </w:rPr>
+              <w:t>existing offering</w:t>
+            </w:r>
+            <w:r>
+              <w:t xml:space="preserve"> and asks how the company's assets and strengths could solve problems for a </w:t>
+            </w:r>
+            <w:r>
+              <w:rPr>
+                <w:b/>
+              </w:rPr>
+              <w:t>new set of users</w:t>
+            </w:r>
+            <w:r>
+              <w:t>.</w:t>
             </w:r>
           </w:p>
           <w:p>
@@ -473,7 +491,7 @@
               <w:pStyle w:val="ListBullet"/>
             </w:pPr>
             <w:r>
-              <w:t>Remove an essential component, ideally the one that seems indispensable, instead of adding features.</w:t>
+              <w:t>Asks what problems current customers face and why they really buy (“not always what we think”), then looks for other markets, demographics, industries or applications for the same product.</w:t>
             </w:r>
           </w:p>
           <w:p>
@@ -481,7 +499,7 @@
               <w:pStyle w:val="ListBullet"/>
             </w:pPr>
             <w:r>
-              <w:t>Work backward (“function follows form”): who would want the reduced product, and what new benefits does the missing part create (cost, size, weight, battery, new settings or customers)?</w:t>
+              <w:t>Asks whether people with a bigger or smaller version of the problem could use it, or use it another way. Global and age-demographic expansion are natural places to look.</w:t>
             </w:r>
           </w:p>
           <w:p>
@@ -489,7 +507,7 @@
               <w:pStyle w:val="ListBullet"/>
             </w:pPr>
             <w:r>
-              <w:t>Structured and driven by constraints, not free-association brainstorming. It reuses existing resources.</w:t>
+              <w:t>Tools: the 2×2 matrix, personas, and listing key company strengths and skills alongside emerging markets [16].</w:t>
             </w:r>
           </w:p>
         </w:tc>
@@ -521,7 +539,13 @@
               <w:pStyle w:val="ListBullet"/>
             </w:pPr>
             <w:r>
-              <w:t>The product is the Ray-Ban Meta minus its signature component, the camera. It keeps the same speakers, microphones, Meta AI, frames, app and sales channels [1][5].</w:t>
+              <w:rPr>
+                <w:b/>
+              </w:rPr>
+              <w:t xml:space="preserve">Existing offering: </w:t>
+            </w:r>
+            <w:r>
+              <w:t>the hardware is the Ray-Ban Meta platform minus the camera, with the same speakers, microphones, Meta AI, frames, app and sales channels [1][5]. It sits in the bottom (existing-offering) row of the matrix.</w:t>
             </w:r>
           </w:p>
           <w:p>
@@ -529,7 +553,13 @@
               <w:pStyle w:val="ListBullet"/>
             </w:pPr>
             <w:r>
-              <w:t>The benefits are exactly what Subtraction predicts: 43 g, slimmer temples that allow new styles, a 12-hour battery versus 9 hours, and a price $100 below Gen 3 [1][3].</w:t>
+              <w:rPr>
+                <w:b/>
+              </w:rPr>
+              <w:t xml:space="preserve">New customers: </w:t>
+            </w:r>
+            <w:r>
+              <w:t>it is aimed at people today's camera glasses push away: privacy-conscious buyers, bystanders, and camera-restricted places such as gyms, cinemas and workplaces, where some venues have banned smart glasses [4][6].</w:t>
             </w:r>
           </w:p>
           <w:p>
@@ -537,7 +567,13 @@
               <w:pStyle w:val="ListBullet"/>
             </w:pPr>
             <w:r>
-              <w:t>It opens “markets” the camera had closed off: camera-restricted venues and workplaces, plus privacy-sensitive users and bystanders [4][6].</w:t>
+              <w:rPr>
+                <w:b/>
+              </w:rPr>
+              <w:t xml:space="preserve">Personas a team would have built (my reconstruction): </w:t>
+            </w:r>
+            <w:r>
+              <w:t>the professional who can't wear a camera at work; the earbud user who wants open ears for calls; the prescription-glasses wearer who wants “smart” without looking like a recorder.</w:t>
             </w:r>
           </w:p>
           <w:p>
@@ -545,7 +581,13 @@
               <w:pStyle w:val="ListBullet"/>
             </w:pPr>
             <w:r>
-              <w:t>It was built on the existing platform under its own codename (“Luna”) and ships three weeks after its reveal. That fits a low-cost derivative product, not a new-technology program [1][5].</w:t>
+              <w:rPr>
+                <w:b/>
+              </w:rPr>
+              <w:t xml:space="preserve">Strengths matched to the new market: </w:t>
+            </w:r>
+            <w:r>
+              <w:t>open-ear audio and microphone engineering, Meta AI and Muse, and EssilorLuxottica's frames, lenses and stores are exactly what a camera-free product needs, so little new capability had to be built [1][7].</w:t>
             </w:r>
           </w:p>
         </w:tc>
@@ -577,10 +619,10 @@
               <w:rPr>
                 <w:b/>
               </w:rPr>
-              <w:t xml:space="preserve">Design Thinking (customer empathy): </w:t>
+              <w:t>Product Expansion using Value Chain Analysis</w:t>
             </w:r>
             <w:r>
-              <w:t>empathize → define → ideate → prototype → test. Under this model the team started from user and bystander pain points (privacy complaints, venue bans, lawsuits, employer restrictions) and designed a product to remove them [5][6].</w:t>
+              <w:t xml:space="preserve"> (new offering, existing customers). Map what a Ray-Ban Meta or Ray-Ban customer spends on after buying glasses: earbuds, music, calls, AI apps, prescription lenses. Audio stands out as an adjacent spend Meta could capture with a new, cheaper audio product, much like the class's Beats Headphones example for Apple [16].</w:t>
             </w:r>
           </w:p>
         </w:tc>
@@ -609,16 +651,25 @@
           </w:tcPr>
           <w:p>
             <w:r>
-              <w:t xml:space="preserve">Design Thinking explains </w:t>
+              <w:t xml:space="preserve">Product Expansion needs a genuinely new offering sold to existing customers, and Ray-Ban Meta Audio is neither. The offering is the existing platform with a part removed. Existing owners already get the same audio, calls and AI in their camera glasses, so a second pair adds little for them. The value comes from people the current product pushes away (privacy-sensitive buyers and camera-restricted settings), which is the defining Customer Expansion question: how can our existing assets solve problems for a new set of users? The other two quadrants fit less well. It isn't </w:t>
             </w:r>
             <w:r>
               <w:rPr>
                 <w:b/>
               </w:rPr>
-              <w:t>why</w:t>
+              <w:t>Core Business</w:t>
             </w:r>
             <w:r>
-              <w:t xml:space="preserve"> Meta acted (the privacy backlash), but not why the answer took this exact form. An empathy-led process could have produced many fixes: a brighter recording light, a physical camera shutter, on-device blurring of bystanders, or stricter software rules. Meta kept the camera on Gen 3, which reviewers say has “the same privacy controls” [13]. For the Audio model it made the signature SIT move instead: remove the defining component, keep everything else, then sell the reduced product to a new segment. The spec sheet is literally the old product minus the camera, with the freed-up space and power spent on weight, battery and style. That pattern points to Subtraction more than to open-ended, customer-led ideation.</w:t>
+              <w:t xml:space="preserve">, because it targets people outside today's customer base. It isn't </w:t>
+            </w:r>
+            <w:r>
+              <w:rPr>
+                <w:b/>
+              </w:rPr>
+              <w:t>Disrupt</w:t>
+            </w:r>
+            <w:r>
+              <w:t>, because there is no new technology or new business model, only the same hardware sale [1][4][6].</w:t>
             </w:r>
           </w:p>
         </w:tc>
@@ -675,12 +726,18 @@
         <w:t>BORDERLINE</w:t>
       </w:r>
       <w:r>
-        <w:t>, leaning toward sustaining (core) innovation rather than true intrapreneurship.</w:t>
+        <w:t>, leaning toward core-business (“little i”) innovation rather than true intrapreneurship.</w:t>
       </w:r>
     </w:p>
     <w:p>
       <w:r>
-        <w:t>Some features are intrapreneurial. It targets a new segment (camera-averse users and camera-restricted venues). It contradicts the flagship value proposition (“the camera is the point”). And someone inside Meta had to win resources and argue for a “less capable” product. In execution, though, it is not a new venture. It reuses the Ray-Ban Meta platform, the EssilorLuxottica partnership, the existing sales channels and Meta AI. It is run inside Reality Labs' wearables organization as one more style in a lineup Meta says will pass 100 options by year-end, and its business model (a hardware sale through the partnership) is unchanged [1][2].</w:t>
+        <w:rPr>
+          <w:b/>
+        </w:rPr>
+        <w:t xml:space="preserve">Class test: </w:t>
+      </w:r>
+      <w:r>
+        <w:t>intrapreneurship is behaving like an entrepreneur inside a large organization: Pinchot's “dreamers who do,” or Jobs's Macintosh team going “back to the garage” [16]. Some features qualify. It targets a new customer set (camera-averse users and camera-restricted venues). It contradicts the flagship value proposition (“the camera is the point”). And someone had to win resources for a “less capable” product. But it is not a Big Bet (“Big I” innovation) and there is no venture creation: no new entity, structure or governance. It reuses the Ray-Ban Meta platform, the EssilorLuxottica partnership, the existing sales channels and Meta AI. It runs inside Reality Labs' wearables organization as one more style in a lineup Meta says will pass 100 options by year-end, and the business model (a hardware sale through the partnership) is unchanged [1][2].</w:t>
       </w:r>
     </w:p>
     <w:p>
@@ -762,10 +819,18 @@
         <w:br/>
       </w:r>
       <w:r>
+        <w:t>Mapped to the class's list of corporate advantages [16]:</w:t>
+      </w:r>
+    </w:p>
+    <w:p>
+      <w:r>
         <w:rPr>
           <w:b/>
         </w:rPr>
-        <w:t xml:space="preserve">(1) The EssilorLuxottica partnership: </w:t>
+        <w:t xml:space="preserve">(1) The EssilorLuxottica partnership </w:t>
+      </w:r>
+      <w:r>
+        <w:t xml:space="preserve">(Brand, Physical Assets, Customer, Market Share): </w:t>
       </w:r>
       <w:r>
         <w:t>the Ray-Ban and Oakley brands, prescription-lens capability, owned retail (Sunglass Hut, LensCrafters, Ray-Ban stores) and manufacturing scaling to 10 million or more pairs a year [7][8]. A startup cannot license Ray-Ban or buy that capacity.</w:t>
@@ -776,7 +841,10 @@
         <w:rPr>
           <w:b/>
         </w:rPr>
-        <w:t xml:space="preserve">(2) Meta AI and the Muse agent: </w:t>
+        <w:t xml:space="preserve">(2) Meta AI and the Muse agent </w:t>
+      </w:r>
+      <w:r>
+        <w:t xml:space="preserve">(R&amp;D, Data Analytics, Funding/Cash Flow): </w:t>
       </w:r>
       <w:r>
         <w:t>frontier-scale models and data centers. For a voice-only device the assistant is the product, and Muse can handle email, book travel and complete purchases [1][14].</w:t>
@@ -787,7 +855,10 @@
         <w:rPr>
           <w:b/>
         </w:rPr>
-        <w:t xml:space="preserve">(3) The existing glasses platform and installed base: </w:t>
+        <w:t xml:space="preserve">(3) The existing glasses platform and installed base </w:t>
+      </w:r>
+      <w:r>
+        <w:t xml:space="preserve">(Product Portfolio, People/Skills, Customer): </w:t>
       </w:r>
       <w:r>
         <w:t>five years of audio, microphone-array, battery and frame-integration engineering (Ray-Ban Stories in 2021 through Gen 3 in 2026), the Meta AI app, and more than 7 million pairs sold in 2025 to cross-sell into [7].</w:t>
@@ -820,10 +891,10 @@
         <w:rPr>
           <w:b/>
         </w:rPr>
-        <w:t xml:space="preserve">Strategic: </w:t>
-      </w:r>
-      <w:r>
-        <w:t>removing the camera cuts against Meta's multimodal AI roadmap (“see what I see”). A champion had to argue that a “less capable” product would not dilute the platform vision.</w:t>
+        <w:t xml:space="preserve">Strategic (the “corporate immune system”): </w:t>
+      </w:r>
+      <w:r>
+        <w:t>the class's corporate immune system protects proven core activities [16], and removing the camera cuts against Meta's multimodal AI roadmap (“see what I see”). A champion had to argue that a “less capable” product would not dilute the platform vision.</w:t>
       </w:r>
     </w:p>
     <w:p>
@@ -972,10 +1043,28 @@
               <w:rPr>
                 <w:b/>
               </w:rPr>
-              <w:t>One-time hardware sale</w:t>
+              <w:t>Markup</w:t>
             </w:r>
             <w:r>
-              <w:t>, plus prescription and Transitions lens upgrades. Indirect (not modeled): AI engagement and future agent-driven commerce through Muse, which strengthen Meta's ecosystem.</w:t>
+              <w:t xml:space="preserve"> (one-time hardware sale) plus </w:t>
+            </w:r>
+            <w:r>
+              <w:rPr>
+                <w:b/>
+              </w:rPr>
+              <w:t>Upselling</w:t>
+            </w:r>
+            <w:r>
+              <w:t xml:space="preserve"> (prescription and Transitions lenses), using the class's New Business Model Templates [16]. Meta AI and Muse are free to the user, a Freemium-style hook that strengthens Meta's ecosystem. The recurring </w:t>
+            </w:r>
+            <w:r>
+              <w:rPr>
+                <w:b/>
+              </w:rPr>
+              <w:t>Subscription</w:t>
+            </w:r>
+            <w:r>
+              <w:t xml:space="preserve"> template the class highlights isn't used yet; a paid Muse tier would add recurring revenue (upside, not modeled).</w:t>
             </w:r>
           </w:p>
         </w:tc>
@@ -1792,6 +1881,11 @@
     </w:p>
     <w:p>
       <w:r>
+        <w:t>[16] Tinskey, M. and Coker, M., Engineering-Based Intrapreneurship (CREATE-Inside) course handouts, Days 1–4 and Financial Statements, Georgia Tech, Fall 2026: “Where Do You Find New Opportunities?” 2×2, Synergy and Value Chain Analysis, New Business Model Templates, Why Are Corporations Advantaged?, Key Factors for Successful Corporate Start-Ups.</w:t>
+      </w:r>
+    </w:p>
+    <w:p>
+      <w:r>
         <w:t xml:space="preserve">WACC: </w:t>
       </w:r>
       <w:hyperlink r:id="rId8" w:history="1">

</xml_diff>